<commit_message>
docs: update with full 3,731 PaddleOCR eval (91.7% exact, 97.2% char)
Full eval results (3,731 VNLP test images, elapsed 71 min CPU):
- Detection rate: 99.9% (3,728/3,731)
- Exact match: 91.7% (3,418/3,728) — final thesis number
- Char accuracy: 97.2%
- Avg confidence: 0.971
- Throughput: 0.87 img/s CPU

OCR improvement journey (same 3,731 images):
- Baseline (YOLO char + LP_detector):       37.8%
- + Fine-tune LP_detector (YOLOv8n):        68.7% (+30.9pp)
- + PaddleOCR backend + length guard:       91.7% (+53.9pp total)

Updated files with final numbers:
- reports/2026-04-15/bao-cao-dinh-ky-tien-do.md (section 3.2, 5.2, 5.3, 6)
- reports/2026-04-15/docx/bao-cao.docx (rebuilt, 2.3 MB)
- slides/build-slides.py + slides/bao-ve-do-an.pptx (slide 19/20/23/24)
- CLAUDE.md (trạng thái 91.7%)

Tests: 101 backend + 45 AI engine = 146 unit tests (100% pass)
</commit_message>
<xml_diff>
--- a/reports/2026-04-15/docx/bao-cao.docx
+++ b/reports/2026-04-15/docx/bao-cao.docx
@@ -11110,7 +11110,7 @@
           <w:sz w:val="26"/>
           <w:szCs w:val="26"/>
         </w:rPr>
-        <w:t xml:space="preserve">PP-OCRv5 CPU trên crops từ finetuned detector: 92.0% exact match (500 ảnh)</w:t>
+        <w:t xml:space="preserve">PP-OCRv5 CPU trên crops từ finetuned detector: 91.7% exact match (3,731 ảnh)</w:t>
       </w:r>
     </w:p>
     <w:p>
@@ -11124,7 +11124,7 @@
           <w:sz w:val="24"/>
           <w:szCs w:val="24"/>
         </w:rPr>
-        <w:t xml:space="preserve">96.5% char accuracy</w:t>
+        <w:t xml:space="preserve">97.2% char accuracy</w:t>
       </w:r>
     </w:p>
     <w:p>
@@ -11141,7 +11141,7 @@
           <w:sz w:val="26"/>
           <w:szCs w:val="26"/>
         </w:rPr>
-        <w:t xml:space="preserve">Cải thiện: +23.3pp so với YOLO char + finetuned (68.7% → 92%)</w:t>
+        <w:t xml:space="preserve">Cải thiện: +23.0pp so với YOLO char + finetuned (68.7% → 91.7%)</w:t>
       </w:r>
     </w:p>
     <w:p>
@@ -11574,7 +11574,7 @@
                 <w:sz w:val="22"/>
                 <w:szCs w:val="22"/>
               </w:rPr>
-              <w:t xml:space="preserve">92.0% (500)*</w:t>
+              <w:t xml:space="preserve">91.7% (3,731)</w:t>
             </w:r>
           </w:p>
         </w:tc>
@@ -11616,7 +11616,7 @@
           <w:sz w:val="26"/>
           <w:szCs w:val="26"/>
         </w:rPr>
-        <w:t xml:space="preserve">* 500-image sample; full 3,731 eval đang chạy.</w:t>
+        <w:t xml:space="preserve">Xác nhận: Full eval 3,731 images → 91.7% exact, 97.2% char accuracy.</w:t>
       </w:r>
     </w:p>
     <w:p>
@@ -16414,7 +16414,7 @@
           <w:sz w:val="26"/>
           <w:szCs w:val="26"/>
         </w:rPr>
-        <w:t xml:space="preserve">| F | PaddleOCR + Finetuned | **92.0% exact match (500 ảnh, +23.3pp)** |</w:t>
+        <w:t xml:space="preserve">| F | PaddleOCR + Finetuned | **91.7% exact (3,731 ảnh), 97.2% char (+54pp baseline)** |</w:t>
       </w:r>
     </w:p>
     <w:p>
@@ -16492,7 +16492,7 @@
           <w:sz w:val="26"/>
           <w:szCs w:val="26"/>
         </w:rPr>
-        <w:t xml:space="preserve">tăng vọt từ 37.8% → 92.0% exact match.</w:t>
+        <w:t xml:space="preserve">tăng vọt từ 37.8% → 91.7% exact match (3,731 ảnh VNLP test).</w:t>
       </w:r>
     </w:p>
     <w:p>
@@ -16949,7 +16949,7 @@
           <w:sz w:val="26"/>
           <w:szCs w:val="26"/>
         </w:rPr>
-        <w:t xml:space="preserve">✅ OCR accuracy 37.8% → 68.7% → 92.0% exact match</w:t>
+        <w:t xml:space="preserve">✅ OCR accuracy 37.8% → 68.7% → 91.7% exact match (3,731 ảnh)</w:t>
       </w:r>
     </w:p>
     <w:p>
@@ -16977,7 +16977,7 @@
           <w:sz w:val="24"/>
           <w:szCs w:val="24"/>
         </w:rPr>
-        <w:t xml:space="preserve">Hướng 2: Swap OCR sang PaddleOCR + length guard → 92.0%</w:t>
+        <w:t xml:space="preserve">Hướng 2: Swap OCR sang PaddleOCR + length guard → 91.7%</w:t>
       </w:r>
     </w:p>
     <w:p>
@@ -19765,7 +19765,7 @@
                 <w:sz w:val="22"/>
                 <w:szCs w:val="22"/>
               </w:rPr>
-              <w:t xml:space="preserve">92.0% ✅✅</w:t>
+              <w:t xml:space="preserve">91.7% (3,731)</w:t>
             </w:r>
           </w:p>
         </w:tc>
@@ -19874,7 +19874,7 @@
                 <w:sz w:val="22"/>
                 <w:szCs w:val="22"/>
               </w:rPr>
-              <w:t xml:space="preserve">96.5% ✅✅</w:t>
+              <w:t xml:space="preserve">97.2% ✅✅</w:t>
             </w:r>
           </w:p>
         </w:tc>
@@ -21240,7 +21240,7 @@
           <w:sz w:val="24"/>
           <w:szCs w:val="24"/>
         </w:rPr>
-        <w:t xml:space="preserve">+ PaddleOCR:       Detection 99.9% | OCR 92.0% | Char 96.5% (500 ảnh)</w:t>
+        <w:t xml:space="preserve">+ PaddleOCR:       Detection 99.9% | OCR 91.7% | Char 97.2% (3,731 ảnh)</w:t>
       </w:r>
     </w:p>
     <w:p>

</xml_diff>